<commit_message>
Add ankle & foot section to high-evidence tests document
Adds Tobillo y pie region (Achilles rupture, lateral instability, syndesmosis, Morton neuroma, plantar fasciitis, anterolateral impingement, MTSS) curated from the Magee ch.13 ankle knowledge base merged from main.
</commit_message>
<xml_diff>
--- a/docs/tests-alta-evidencia.docx
+++ b/docs/tests-alta-evidencia.docx
@@ -6436,6 +6436,772 @@
           <w:szCs w:val="16"/>
         </w:rPr>
         <w:t xml:space="preserve">Esp ~92 % · Sens 7-39 %.</w:t>
+      </w:r>
+    </w:p>
+    <w:p>
+      <w:pPr>
+        <w:pStyle w:val="Heading1"/>
+        <w:keepNext/>
+        <w:shd w:fill="F3E8FF" w:val="clear"/>
+        <w:spacing w:after="80" w:before="200"/>
+      </w:pPr>
+      <w:r>
+        <w:rPr>
+          <w:rFonts w:ascii="Calibri" w:cs="Calibri" w:eastAsia="Calibri" w:hAnsi="Calibri"/>
+          <w:b/>
+          <w:bCs/>
+          <w:color w:val="4C1D6B"/>
+          <w:sz w:val="24"/>
+          <w:szCs w:val="24"/>
+        </w:rPr>
+        <w:t xml:space="preserve">  Tobillo y pie</w:t>
+      </w:r>
+    </w:p>
+    <w:p>
+      <w:pPr>
+        <w:pStyle w:val="Heading2"/>
+        <w:keepNext/>
+        <w:spacing w:after="50" w:before="120"/>
+      </w:pPr>
+      <w:r>
+        <w:rPr>
+          <w:rFonts w:ascii="Calibri" w:cs="Calibri" w:eastAsia="Calibri" w:hAnsi="Calibri"/>
+          <w:b/>
+          <w:bCs/>
+          <w:color w:val="6B21A8"/>
+          <w:sz w:val="19"/>
+          <w:szCs w:val="19"/>
+        </w:rPr>
+        <w:t xml:space="preserve">Rotura del tendón de Aquiles</w:t>
+      </w:r>
+    </w:p>
+    <w:p>
+      <w:pPr>
+        <w:keepNext/>
+        <w:spacing w:after="10" w:before="40"/>
+      </w:pPr>
+      <w:r>
+        <w:rPr>
+          <w:rFonts w:ascii="Calibri" w:cs="Calibri" w:eastAsia="Calibri" w:hAnsi="Calibri"/>
+          <w:b/>
+          <w:bCs/>
+          <w:color w:val="111827"/>
+          <w:sz w:val="18"/>
+          <w:szCs w:val="18"/>
+        </w:rPr>
+        <w:t xml:space="preserve">Test de Thompson (Simmonds)  </w:t>
+      </w:r>
+      <w:r>
+        <w:rPr>
+          <w:rFonts w:ascii="Calibri" w:cs="Calibri" w:eastAsia="Calibri" w:hAnsi="Calibri"/>
+          <w:color w:val="1D4ED8"/>
+          <w:sz w:val="14"/>
+          <w:szCs w:val="14"/>
+        </w:rPr>
+        <w:t xml:space="preserve">■ Confirma y descarta</w:t>
+      </w:r>
+    </w:p>
+    <w:p>
+      <w:pPr>
+        <w:spacing w:after="10"/>
+      </w:pPr>
+      <w:r>
+        <w:rPr>
+          <w:rFonts w:ascii="Calibri" w:cs="Calibri" w:eastAsia="Calibri" w:hAnsi="Calibri"/>
+          <w:color w:val="374151"/>
+          <w:sz w:val="17"/>
+          <w:szCs w:val="17"/>
+        </w:rPr>
+        <w:t xml:space="preserve">En prono se comprime la pantorrilla; ausencia de flexión plantar pasiva es positiva.</w:t>
+      </w:r>
+    </w:p>
+    <w:p>
+      <w:pPr>
+        <w:spacing w:after="60"/>
+      </w:pPr>
+      <w:r>
+        <w:rPr>
+          <w:rFonts w:ascii="Calibri" w:cs="Calibri" w:eastAsia="Calibri" w:hAnsi="Calibri"/>
+          <w:b/>
+          <w:bCs/>
+          <w:i/>
+          <w:iCs/>
+          <w:color w:val="6B7280"/>
+          <w:sz w:val="16"/>
+          <w:szCs w:val="16"/>
+        </w:rPr>
+        <w:t xml:space="preserve">Precisión. </w:t>
+      </w:r>
+      <w:r>
+        <w:rPr>
+          <w:rFonts w:ascii="Calibri" w:cs="Calibri" w:eastAsia="Calibri" w:hAnsi="Calibri"/>
+          <w:i/>
+          <w:iCs/>
+          <w:color w:val="6B7280"/>
+          <w:sz w:val="16"/>
+          <w:szCs w:val="16"/>
+        </w:rPr>
+        <w:t xml:space="preserve">Sens ~96-100 % · Esp ~93 % · LR− ~0.04. Test de referencia (descarte de primera línea).</w:t>
+      </w:r>
+    </w:p>
+    <w:p>
+      <w:pPr>
+        <w:keepNext/>
+        <w:spacing w:after="10" w:before="40"/>
+      </w:pPr>
+      <w:r>
+        <w:rPr>
+          <w:rFonts w:ascii="Calibri" w:cs="Calibri" w:eastAsia="Calibri" w:hAnsi="Calibri"/>
+          <w:b/>
+          <w:bCs/>
+          <w:color w:val="111827"/>
+          <w:sz w:val="18"/>
+          <w:szCs w:val="18"/>
+        </w:rPr>
+        <w:t xml:space="preserve">Test de Matles (flexión de rodilla)  </w:t>
+      </w:r>
+      <w:r>
+        <w:rPr>
+          <w:rFonts w:ascii="Calibri" w:cs="Calibri" w:eastAsia="Calibri" w:hAnsi="Calibri"/>
+          <w:color w:val="166534"/>
+          <w:sz w:val="14"/>
+          <w:szCs w:val="14"/>
+        </w:rPr>
+        <w:t xml:space="preserve">■ Cribado / descarte</w:t>
+      </w:r>
+    </w:p>
+    <w:p>
+      <w:pPr>
+        <w:spacing w:after="10"/>
+      </w:pPr>
+      <w:r>
+        <w:rPr>
+          <w:rFonts w:ascii="Calibri" w:cs="Calibri" w:eastAsia="Calibri" w:hAnsi="Calibri"/>
+          <w:color w:val="374151"/>
+          <w:sz w:val="17"/>
+          <w:szCs w:val="17"/>
+        </w:rPr>
+        <w:t xml:space="preserve">En prono, al flexionar la rodilla el pie cae a neutro/dorsiflexión (pierde el tono en reposo).</w:t>
+      </w:r>
+    </w:p>
+    <w:p>
+      <w:pPr>
+        <w:spacing w:after="60"/>
+      </w:pPr>
+      <w:r>
+        <w:rPr>
+          <w:rFonts w:ascii="Calibri" w:cs="Calibri" w:eastAsia="Calibri" w:hAnsi="Calibri"/>
+          <w:b/>
+          <w:bCs/>
+          <w:i/>
+          <w:iCs/>
+          <w:color w:val="6B7280"/>
+          <w:sz w:val="16"/>
+          <w:szCs w:val="16"/>
+        </w:rPr>
+        <w:t xml:space="preserve">Precisión. </w:t>
+      </w:r>
+      <w:r>
+        <w:rPr>
+          <w:rFonts w:ascii="Calibri" w:cs="Calibri" w:eastAsia="Calibri" w:hAnsi="Calibri"/>
+          <w:i/>
+          <w:iCs/>
+          <w:color w:val="6B7280"/>
+          <w:sz w:val="16"/>
+          <w:szCs w:val="16"/>
+        </w:rPr>
+        <w:t xml:space="preserve">Sens ~88 %. Complementa al Thompson.</w:t>
+      </w:r>
+    </w:p>
+    <w:p>
+      <w:pPr>
+        <w:pStyle w:val="Heading2"/>
+        <w:keepNext/>
+        <w:spacing w:after="50" w:before="120"/>
+      </w:pPr>
+      <w:r>
+        <w:rPr>
+          <w:rFonts w:ascii="Calibri" w:cs="Calibri" w:eastAsia="Calibri" w:hAnsi="Calibri"/>
+          <w:b/>
+          <w:bCs/>
+          <w:color w:val="6B21A8"/>
+          <w:sz w:val="19"/>
+          <w:szCs w:val="19"/>
+        </w:rPr>
+        <w:t xml:space="preserve">Inestabilidad lateral (LTFA / LCF)</w:t>
+      </w:r>
+    </w:p>
+    <w:p>
+      <w:pPr>
+        <w:keepNext/>
+        <w:spacing w:after="10" w:before="40"/>
+      </w:pPr>
+      <w:r>
+        <w:rPr>
+          <w:rFonts w:ascii="Calibri" w:cs="Calibri" w:eastAsia="Calibri" w:hAnsi="Calibri"/>
+          <w:b/>
+          <w:bCs/>
+          <w:color w:val="111827"/>
+          <w:sz w:val="18"/>
+          <w:szCs w:val="18"/>
+        </w:rPr>
+        <w:t xml:space="preserve">Cajón anterior del tobillo (diferido)  </w:t>
+      </w:r>
+      <w:r>
+        <w:rPr>
+          <w:rFonts w:ascii="Calibri" w:cs="Calibri" w:eastAsia="Calibri" w:hAnsi="Calibri"/>
+          <w:color w:val="1D4ED8"/>
+          <w:sz w:val="14"/>
+          <w:szCs w:val="14"/>
+        </w:rPr>
+        <w:t xml:space="preserve">■ Confirma y descarta</w:t>
+      </w:r>
+    </w:p>
+    <w:p>
+      <w:pPr>
+        <w:spacing w:after="10"/>
+      </w:pPr>
+      <w:r>
+        <w:rPr>
+          <w:rFonts w:ascii="Calibri" w:cs="Calibri" w:eastAsia="Calibri" w:hAnsi="Calibri"/>
+          <w:color w:val="374151"/>
+          <w:sz w:val="17"/>
+          <w:szCs w:val="17"/>
+        </w:rPr>
+        <w:t xml:space="preserve">Traslación anterior del astrágalo en flexión plantar; más rentable a los 4-5 días, tras ceder dolor y espasmo.</w:t>
+      </w:r>
+    </w:p>
+    <w:p>
+      <w:pPr>
+        <w:spacing w:after="60"/>
+      </w:pPr>
+      <w:r>
+        <w:rPr>
+          <w:rFonts w:ascii="Calibri" w:cs="Calibri" w:eastAsia="Calibri" w:hAnsi="Calibri"/>
+          <w:b/>
+          <w:bCs/>
+          <w:i/>
+          <w:iCs/>
+          <w:color w:val="6B7280"/>
+          <w:sz w:val="16"/>
+          <w:szCs w:val="16"/>
+        </w:rPr>
+        <w:t xml:space="preserve">Precisión. </w:t>
+      </w:r>
+      <w:r>
+        <w:rPr>
+          <w:rFonts w:ascii="Calibri" w:cs="Calibri" w:eastAsia="Calibri" w:hAnsi="Calibri"/>
+          <w:i/>
+          <w:iCs/>
+          <w:color w:val="6B7280"/>
+          <w:sz w:val="16"/>
+          <w:szCs w:val="16"/>
+        </w:rPr>
+        <w:t xml:space="preserve">Diferido: Sens ~96 % · Esp ~84 % (van Dijk, combinado con hematoma y dolor a la palpación). En agudo la sensibilidad es baja.</w:t>
+      </w:r>
+    </w:p>
+    <w:p>
+      <w:pPr>
+        <w:pStyle w:val="Heading2"/>
+        <w:keepNext/>
+        <w:spacing w:after="50" w:before="120"/>
+      </w:pPr>
+      <w:r>
+        <w:rPr>
+          <w:rFonts w:ascii="Calibri" w:cs="Calibri" w:eastAsia="Calibri" w:hAnsi="Calibri"/>
+          <w:b/>
+          <w:bCs/>
+          <w:color w:val="6B21A8"/>
+          <w:sz w:val="19"/>
+          <w:szCs w:val="19"/>
+        </w:rPr>
+        <w:t xml:space="preserve">Sindesmosis (esguince alto)</w:t>
+      </w:r>
+    </w:p>
+    <w:p>
+      <w:pPr>
+        <w:keepNext/>
+        <w:spacing w:after="10" w:before="40"/>
+      </w:pPr>
+      <w:r>
+        <w:rPr>
+          <w:rFonts w:ascii="Calibri" w:cs="Calibri" w:eastAsia="Calibri" w:hAnsi="Calibri"/>
+          <w:b/>
+          <w:bCs/>
+          <w:color w:val="111827"/>
+          <w:sz w:val="18"/>
+          <w:szCs w:val="18"/>
+        </w:rPr>
+        <w:t xml:space="preserve">Squeeze test (compresión de la pierna)  </w:t>
+      </w:r>
+      <w:r>
+        <w:rPr>
+          <w:rFonts w:ascii="Calibri" w:cs="Calibri" w:eastAsia="Calibri" w:hAnsi="Calibri"/>
+          <w:color w:val="9A3412"/>
+          <w:sz w:val="14"/>
+          <w:szCs w:val="14"/>
+        </w:rPr>
+        <w:t xml:space="preserve">■ Confirmatorio</w:t>
+      </w:r>
+    </w:p>
+    <w:p>
+      <w:pPr>
+        <w:spacing w:after="10"/>
+      </w:pPr>
+      <w:r>
+        <w:rPr>
+          <w:rFonts w:ascii="Calibri" w:cs="Calibri" w:eastAsia="Calibri" w:hAnsi="Calibri"/>
+          <w:color w:val="374151"/>
+          <w:sz w:val="17"/>
+          <w:szCs w:val="17"/>
+        </w:rPr>
+        <w:t xml:space="preserve">Compresión tibia-peroné en la pantorrilla; dolor en la sindesmosis distal es positivo.</w:t>
+      </w:r>
+    </w:p>
+    <w:p>
+      <w:pPr>
+        <w:spacing w:after="60"/>
+      </w:pPr>
+      <w:r>
+        <w:rPr>
+          <w:rFonts w:ascii="Calibri" w:cs="Calibri" w:eastAsia="Calibri" w:hAnsi="Calibri"/>
+          <w:b/>
+          <w:bCs/>
+          <w:i/>
+          <w:iCs/>
+          <w:color w:val="6B7280"/>
+          <w:sz w:val="16"/>
+          <w:szCs w:val="16"/>
+        </w:rPr>
+        <w:t xml:space="preserve">Precisión. </w:t>
+      </w:r>
+      <w:r>
+        <w:rPr>
+          <w:rFonts w:ascii="Calibri" w:cs="Calibri" w:eastAsia="Calibri" w:hAnsi="Calibri"/>
+          <w:i/>
+          <w:iCs/>
+          <w:color w:val="6B7280"/>
+          <w:sz w:val="16"/>
+          <w:szCs w:val="16"/>
+        </w:rPr>
+        <w:t xml:space="preserve">Esp ~88-93 % · Sens ~30 %. Confirma; un negativo no descarta.</w:t>
+      </w:r>
+    </w:p>
+    <w:p>
+      <w:pPr>
+        <w:keepNext/>
+        <w:spacing w:after="10" w:before="40"/>
+      </w:pPr>
+      <w:r>
+        <w:rPr>
+          <w:rFonts w:ascii="Calibri" w:cs="Calibri" w:eastAsia="Calibri" w:hAnsi="Calibri"/>
+          <w:b/>
+          <w:bCs/>
+          <w:color w:val="111827"/>
+          <w:sz w:val="18"/>
+          <w:szCs w:val="18"/>
+        </w:rPr>
+        <w:t xml:space="preserve">Test de rotación externa (Kleiger)  </w:t>
+      </w:r>
+      <w:r>
+        <w:rPr>
+          <w:rFonts w:ascii="Calibri" w:cs="Calibri" w:eastAsia="Calibri" w:hAnsi="Calibri"/>
+          <w:color w:val="9A3412"/>
+          <w:sz w:val="14"/>
+          <w:szCs w:val="14"/>
+        </w:rPr>
+        <w:t xml:space="preserve">■ Confirmatorio</w:t>
+      </w:r>
+    </w:p>
+    <w:p>
+      <w:pPr>
+        <w:spacing w:after="10"/>
+      </w:pPr>
+      <w:r>
+        <w:rPr>
+          <w:rFonts w:ascii="Calibri" w:cs="Calibri" w:eastAsia="Calibri" w:hAnsi="Calibri"/>
+          <w:color w:val="374151"/>
+          <w:sz w:val="17"/>
+          <w:szCs w:val="17"/>
+        </w:rPr>
+        <w:t xml:space="preserve">Estrés de rotación lateral del pie a 90°; dolor sobre los ligamentos tibioperoneos.</w:t>
+      </w:r>
+    </w:p>
+    <w:p>
+      <w:pPr>
+        <w:spacing w:after="60"/>
+      </w:pPr>
+      <w:r>
+        <w:rPr>
+          <w:rFonts w:ascii="Calibri" w:cs="Calibri" w:eastAsia="Calibri" w:hAnsi="Calibri"/>
+          <w:b/>
+          <w:bCs/>
+          <w:i/>
+          <w:iCs/>
+          <w:color w:val="6B7280"/>
+          <w:sz w:val="16"/>
+          <w:szCs w:val="16"/>
+        </w:rPr>
+        <w:t xml:space="preserve">Precisión. </w:t>
+      </w:r>
+      <w:r>
+        <w:rPr>
+          <w:rFonts w:ascii="Calibri" w:cs="Calibri" w:eastAsia="Calibri" w:hAnsi="Calibri"/>
+          <w:i/>
+          <w:iCs/>
+          <w:color w:val="6B7280"/>
+          <w:sz w:val="16"/>
+          <w:szCs w:val="16"/>
+        </w:rPr>
+        <w:t xml:space="preserve">Esp ~85 % · Sens ~20 %. Dolor medial sugiere lesión asociada del deltoideo.</w:t>
+      </w:r>
+    </w:p>
+    <w:p>
+      <w:pPr>
+        <w:pStyle w:val="Heading2"/>
+        <w:keepNext/>
+        <w:spacing w:after="50" w:before="120"/>
+      </w:pPr>
+      <w:r>
+        <w:rPr>
+          <w:rFonts w:ascii="Calibri" w:cs="Calibri" w:eastAsia="Calibri" w:hAnsi="Calibri"/>
+          <w:b/>
+          <w:bCs/>
+          <w:color w:val="6B21A8"/>
+          <w:sz w:val="19"/>
+          <w:szCs w:val="19"/>
+        </w:rPr>
+        <w:t xml:space="preserve">Neuroma de Morton (interdigital)</w:t>
+      </w:r>
+    </w:p>
+    <w:p>
+      <w:pPr>
+        <w:keepNext/>
+        <w:spacing w:after="10" w:before="40"/>
+      </w:pPr>
+      <w:r>
+        <w:rPr>
+          <w:rFonts w:ascii="Calibri" w:cs="Calibri" w:eastAsia="Calibri" w:hAnsi="Calibri"/>
+          <w:b/>
+          <w:bCs/>
+          <w:color w:val="111827"/>
+          <w:sz w:val="18"/>
+          <w:szCs w:val="18"/>
+        </w:rPr>
+        <w:t xml:space="preserve">Morton squeeze + click de Mulder  </w:t>
+      </w:r>
+      <w:r>
+        <w:rPr>
+          <w:rFonts w:ascii="Calibri" w:cs="Calibri" w:eastAsia="Calibri" w:hAnsi="Calibri"/>
+          <w:color w:val="1D4ED8"/>
+          <w:sz w:val="14"/>
+          <w:szCs w:val="14"/>
+        </w:rPr>
+        <w:t xml:space="preserve">■ Confirma y descarta</w:t>
+      </w:r>
+    </w:p>
+    <w:p>
+      <w:pPr>
+        <w:spacing w:after="10"/>
+      </w:pPr>
+      <w:r>
+        <w:rPr>
+          <w:rFonts w:ascii="Calibri" w:cs="Calibri" w:eastAsia="Calibri" w:hAnsi="Calibri"/>
+          <w:color w:val="374151"/>
+          <w:sz w:val="17"/>
+          <w:szCs w:val="17"/>
+        </w:rPr>
+        <w:t xml:space="preserve">Compresión de las cabezas metatarsianas; dolor reproducido y chasquido palpable (Mulder).</w:t>
+      </w:r>
+    </w:p>
+    <w:p>
+      <w:pPr>
+        <w:spacing w:after="60"/>
+      </w:pPr>
+      <w:r>
+        <w:rPr>
+          <w:rFonts w:ascii="Calibri" w:cs="Calibri" w:eastAsia="Calibri" w:hAnsi="Calibri"/>
+          <w:b/>
+          <w:bCs/>
+          <w:i/>
+          <w:iCs/>
+          <w:color w:val="6B7280"/>
+          <w:sz w:val="16"/>
+          <w:szCs w:val="16"/>
+        </w:rPr>
+        <w:t xml:space="preserve">Precisión. </w:t>
+      </w:r>
+      <w:r>
+        <w:rPr>
+          <w:rFonts w:ascii="Calibri" w:cs="Calibri" w:eastAsia="Calibri" w:hAnsi="Calibri"/>
+          <w:i/>
+          <w:iCs/>
+          <w:color w:val="6B7280"/>
+          <w:sz w:val="16"/>
+          <w:szCs w:val="16"/>
+        </w:rPr>
+        <w:t xml:space="preserve">Buena sensibilidad y especificidad frente a ecografía.</w:t>
+      </w:r>
+    </w:p>
+    <w:p>
+      <w:pPr>
+        <w:pStyle w:val="Heading2"/>
+        <w:keepNext/>
+        <w:spacing w:after="50" w:before="120"/>
+      </w:pPr>
+      <w:r>
+        <w:rPr>
+          <w:rFonts w:ascii="Calibri" w:cs="Calibri" w:eastAsia="Calibri" w:hAnsi="Calibri"/>
+          <w:b/>
+          <w:bCs/>
+          <w:color w:val="6B21A8"/>
+          <w:sz w:val="19"/>
+          <w:szCs w:val="19"/>
+        </w:rPr>
+        <w:t xml:space="preserve">Fascitis plantar</w:t>
+      </w:r>
+    </w:p>
+    <w:p>
+      <w:pPr>
+        <w:keepNext/>
+        <w:spacing w:after="10" w:before="40"/>
+      </w:pPr>
+      <w:r>
+        <w:rPr>
+          <w:rFonts w:ascii="Calibri" w:cs="Calibri" w:eastAsia="Calibri" w:hAnsi="Calibri"/>
+          <w:b/>
+          <w:bCs/>
+          <w:color w:val="111827"/>
+          <w:sz w:val="18"/>
+          <w:szCs w:val="18"/>
+        </w:rPr>
+        <w:t xml:space="preserve">Test de Windlass (extensión del hallux)  </w:t>
+      </w:r>
+      <w:r>
+        <w:rPr>
+          <w:rFonts w:ascii="Calibri" w:cs="Calibri" w:eastAsia="Calibri" w:hAnsi="Calibri"/>
+          <w:color w:val="9A3412"/>
+          <w:sz w:val="14"/>
+          <w:szCs w:val="14"/>
+        </w:rPr>
+        <w:t xml:space="preserve">■ Confirmatorio</w:t>
+      </w:r>
+    </w:p>
+    <w:p>
+      <w:pPr>
+        <w:spacing w:after="10"/>
+      </w:pPr>
+      <w:r>
+        <w:rPr>
+          <w:rFonts w:ascii="Calibri" w:cs="Calibri" w:eastAsia="Calibri" w:hAnsi="Calibri"/>
+          <w:color w:val="374151"/>
+          <w:sz w:val="17"/>
+          <w:szCs w:val="17"/>
+        </w:rPr>
+        <w:t xml:space="preserve">Dorsiflexión pasiva del primer dedo; dolor en la inserción plantar (calcáneo medial).</w:t>
+      </w:r>
+    </w:p>
+    <w:p>
+      <w:pPr>
+        <w:spacing w:after="60"/>
+      </w:pPr>
+      <w:r>
+        <w:rPr>
+          <w:rFonts w:ascii="Calibri" w:cs="Calibri" w:eastAsia="Calibri" w:hAnsi="Calibri"/>
+          <w:b/>
+          <w:bCs/>
+          <w:i/>
+          <w:iCs/>
+          <w:color w:val="6B7280"/>
+          <w:sz w:val="16"/>
+          <w:szCs w:val="16"/>
+        </w:rPr>
+        <w:t xml:space="preserve">Precisión. </w:t>
+      </w:r>
+      <w:r>
+        <w:rPr>
+          <w:rFonts w:ascii="Calibri" w:cs="Calibri" w:eastAsia="Calibri" w:hAnsi="Calibri"/>
+          <w:i/>
+          <w:iCs/>
+          <w:color w:val="6B7280"/>
+          <w:sz w:val="16"/>
+          <w:szCs w:val="16"/>
+        </w:rPr>
+        <w:t xml:space="preserve">Esp ~100 % · Sens ~32 % en descarga.</w:t>
+      </w:r>
+    </w:p>
+    <w:p>
+      <w:pPr>
+        <w:pStyle w:val="Heading2"/>
+        <w:keepNext/>
+        <w:spacing w:after="50" w:before="120"/>
+      </w:pPr>
+      <w:r>
+        <w:rPr>
+          <w:rFonts w:ascii="Calibri" w:cs="Calibri" w:eastAsia="Calibri" w:hAnsi="Calibri"/>
+          <w:b/>
+          <w:bCs/>
+          <w:color w:val="6B21A8"/>
+          <w:sz w:val="19"/>
+          <w:szCs w:val="19"/>
+        </w:rPr>
+        <w:t xml:space="preserve">Pinzamiento anterolateral</w:t>
+      </w:r>
+    </w:p>
+    <w:p>
+      <w:pPr>
+        <w:keepNext/>
+        <w:spacing w:after="10" w:before="40"/>
+      </w:pPr>
+      <w:r>
+        <w:rPr>
+          <w:rFonts w:ascii="Calibri" w:cs="Calibri" w:eastAsia="Calibri" w:hAnsi="Calibri"/>
+          <w:b/>
+          <w:bCs/>
+          <w:color w:val="111827"/>
+          <w:sz w:val="18"/>
+          <w:szCs w:val="18"/>
+        </w:rPr>
+        <w:t xml:space="preserve">Test de pinzamiento sinovial  </w:t>
+      </w:r>
+      <w:r>
+        <w:rPr>
+          <w:rFonts w:ascii="Calibri" w:cs="Calibri" w:eastAsia="Calibri" w:hAnsi="Calibri"/>
+          <w:color w:val="1D4ED8"/>
+          <w:sz w:val="14"/>
+          <w:szCs w:val="14"/>
+        </w:rPr>
+        <w:t xml:space="preserve">■ Confirma y descarta</w:t>
+      </w:r>
+    </w:p>
+    <w:p>
+      <w:pPr>
+        <w:spacing w:after="10"/>
+      </w:pPr>
+      <w:r>
+        <w:rPr>
+          <w:rFonts w:ascii="Calibri" w:cs="Calibri" w:eastAsia="Calibri" w:hAnsi="Calibri"/>
+          <w:color w:val="374151"/>
+          <w:sz w:val="17"/>
+          <w:szCs w:val="17"/>
+        </w:rPr>
+        <w:t xml:space="preserve">Presión en la gotera anterolateral mientras se pasa de flexión plantar a dorsiflexión.</w:t>
+      </w:r>
+    </w:p>
+    <w:p>
+      <w:pPr>
+        <w:spacing w:after="60"/>
+      </w:pPr>
+      <w:r>
+        <w:rPr>
+          <w:rFonts w:ascii="Calibri" w:cs="Calibri" w:eastAsia="Calibri" w:hAnsi="Calibri"/>
+          <w:b/>
+          <w:bCs/>
+          <w:i/>
+          <w:iCs/>
+          <w:color w:val="6B7280"/>
+          <w:sz w:val="16"/>
+          <w:szCs w:val="16"/>
+        </w:rPr>
+        <w:t xml:space="preserve">Precisión. </w:t>
+      </w:r>
+      <w:r>
+        <w:rPr>
+          <w:rFonts w:ascii="Calibri" w:cs="Calibri" w:eastAsia="Calibri" w:hAnsi="Calibri"/>
+          <w:i/>
+          <w:iCs/>
+          <w:color w:val="6B7280"/>
+          <w:sz w:val="16"/>
+          <w:szCs w:val="16"/>
+        </w:rPr>
+        <w:t xml:space="preserve">Sens ~94.8 % · Esp ~88 % (frente a RM/artroscopia).</w:t>
+      </w:r>
+    </w:p>
+    <w:p>
+      <w:pPr>
+        <w:pStyle w:val="Heading2"/>
+        <w:keepNext/>
+        <w:spacing w:after="50" w:before="120"/>
+      </w:pPr>
+      <w:r>
+        <w:rPr>
+          <w:rFonts w:ascii="Calibri" w:cs="Calibri" w:eastAsia="Calibri" w:hAnsi="Calibri"/>
+          <w:b/>
+          <w:bCs/>
+          <w:color w:val="6B21A8"/>
+          <w:sz w:val="19"/>
+          <w:szCs w:val="19"/>
+        </w:rPr>
+        <w:t xml:space="preserve">Síndrome de estrés tibial medial (MTSS)</w:t>
+      </w:r>
+    </w:p>
+    <w:p>
+      <w:pPr>
+        <w:keepNext/>
+        <w:spacing w:after="10" w:before="40"/>
+      </w:pPr>
+      <w:r>
+        <w:rPr>
+          <w:rFonts w:ascii="Calibri" w:cs="Calibri" w:eastAsia="Calibri" w:hAnsi="Calibri"/>
+          <w:b/>
+          <w:bCs/>
+          <w:color w:val="111827"/>
+          <w:sz w:val="18"/>
+          <w:szCs w:val="18"/>
+        </w:rPr>
+        <w:t xml:space="preserve">Shin oedema + shin palpation (SOT + SPT)  </w:t>
+      </w:r>
+      <w:r>
+        <w:rPr>
+          <w:rFonts w:ascii="Calibri" w:cs="Calibri" w:eastAsia="Calibri" w:hAnsi="Calibri"/>
+          <w:color w:val="1D4ED8"/>
+          <w:sz w:val="14"/>
+          <w:szCs w:val="14"/>
+        </w:rPr>
+        <w:t xml:space="preserve">■ Confirma y descarta</w:t>
+      </w:r>
+    </w:p>
+    <w:p>
+      <w:pPr>
+        <w:spacing w:after="10"/>
+      </w:pPr>
+      <w:r>
+        <w:rPr>
+          <w:rFonts w:ascii="Calibri" w:cs="Calibri" w:eastAsia="Calibri" w:hAnsi="Calibri"/>
+          <w:color w:val="374151"/>
+          <w:sz w:val="17"/>
+          <w:szCs w:val="17"/>
+        </w:rPr>
+        <w:t xml:space="preserve">Edema con fóvea en el tercio distal tibial + dolor difuso a lo largo del borde posteromedial.</w:t>
+      </w:r>
+    </w:p>
+    <w:p>
+      <w:pPr>
+        <w:spacing w:after="60"/>
+      </w:pPr>
+      <w:r>
+        <w:rPr>
+          <w:rFonts w:ascii="Calibri" w:cs="Calibri" w:eastAsia="Calibri" w:hAnsi="Calibri"/>
+          <w:b/>
+          <w:bCs/>
+          <w:i/>
+          <w:iCs/>
+          <w:color w:val="6B7280"/>
+          <w:sz w:val="16"/>
+          <w:szCs w:val="16"/>
+        </w:rPr>
+        <w:t xml:space="preserve">Precisión. </w:t>
+      </w:r>
+      <w:r>
+        <w:rPr>
+          <w:rFonts w:ascii="Calibri" w:cs="Calibri" w:eastAsia="Calibri" w:hAnsi="Calibri"/>
+          <w:i/>
+          <w:iCs/>
+          <w:color w:val="6B7280"/>
+          <w:sz w:val="16"/>
+          <w:szCs w:val="16"/>
+        </w:rPr>
+        <w:t xml:space="preserve">Combinados: LR+ ~7.94 · LR− &lt;0.001. El dolor difuso distingue MTSS de la fractura de estrés (dolor puntual).</w:t>
       </w:r>
     </w:p>
     <w:sectPr>

</xml_diff>